<commit_message>
Refresh full documentation map with OSF registration and current gates.
</commit_message>
<xml_diff>
--- a/docs/NeuroTrace-DAG_Dataset_Input_Flow_Results.docx
+++ b/docs/NeuroTrace-DAG_Dataset_Input_Flow_Results.docx
@@ -2,7 +2,7 @@
 <file path=word/document.xml><?xml version="1.0" encoding="utf-8"?>
 <w:document xmlns:w="http://schemas.openxmlformats.org/wordprocessingml/2006/main" xmlns:m="http://schemas.openxmlformats.org/officeDocument/2006/math" xmlns:r="http://schemas.openxmlformats.org/officeDocument/2006/relationships" xmlns:o="urn:schemas-microsoft-com:office:office" xmlns:v="urn:schemas-microsoft-com:vml" xmlns:w10="urn:schemas-microsoft-com:office:word" xmlns:a="http://schemas.openxmlformats.org/drawingml/2006/main" xmlns:pic="http://schemas.openxmlformats.org/drawingml/2006/picture" xmlns:wp="http://schemas.openxmlformats.org/drawingml/2006/wordprocessingDrawing">
   <w:body>
-    <w:bookmarkStart w:id="54" w:name="X4da7c7b2f81fee9c19422db364db5e7038987e1"/>
+    <w:bookmarkStart w:id="67" w:name="X4da7c7b2f81fee9c19422db364db5e7038987e1"/>
     <w:p>
       <w:pPr>
         <w:pStyle w:val="Heading1"/>
@@ -73,7 +73,7 @@
       <w:r>
         <w:t xml:space="preserve"> </w:t>
       </w:r>
-      <w:hyperlink r:id="rId9">
+      <w:hyperlink r:id="rId20">
         <w:r>
           <w:rPr>
             <w:rStyle w:val="VerbatimChar"/>
@@ -114,7 +114,7 @@
       <w:r>
         <w:t xml:space="preserve"> </w:t>
       </w:r>
-      <w:hyperlink r:id="rId10">
+      <w:hyperlink r:id="rId21">
         <w:r>
           <w:rPr>
             <w:rStyle w:val="VerbatimChar"/>
@@ -144,10 +144,65 @@
         <w:t xml:space="preserve"> </w:t>
       </w:r>
       <w:r>
-        <w:t xml:space="preserve">evaluation-validity (how next-item metrics interact with continue / revisit / advance structure), not a claim that we shipped a SOTA recommender.</w:t>
+        <w:t xml:space="preserve">we care whether next-item scores track continue / revisit / advance structure (and action units)—not whether we shipped a ranking champion.</w:t>
       </w:r>
     </w:p>
-    <w:bookmarkStart w:id="11" w:name="Xcdad859901e63686c5c7795f442b2d03f6e142a"/>
+    <w:p>
+      <w:pPr>
+        <w:pStyle w:val="BodyText"/>
+      </w:pPr>
+      <w:r>
+        <w:rPr>
+          <w:b/>
+          <w:bCs/>
+        </w:rPr>
+        <w:t xml:space="preserve">Code:</w:t>
+      </w:r>
+      <w:r>
+        <w:t xml:space="preserve"> </w:t>
+      </w:r>
+      <w:r>
+        <w:t xml:space="preserve">https://github.com/Oscar-man-shrestha/eval-validity-edu</w:t>
+      </w:r>
+      <w:r>
+        <w:br/>
+      </w:r>
+      <w:r>
+        <w:rPr>
+          <w:b/>
+          <w:bCs/>
+        </w:rPr>
+        <w:t xml:space="preserve">OSF:</w:t>
+      </w:r>
+      <w:r>
+        <w:t xml:space="preserve"> </w:t>
+      </w:r>
+      <w:r>
+        <w:t xml:space="preserve">https://osf.io/24sxf (submitted; pending approval)</w:t>
+      </w:r>
+      <w:r>
+        <w:br/>
+      </w:r>
+      <w:r>
+        <w:rPr>
+          <w:b/>
+          <w:bCs/>
+        </w:rPr>
+        <w:t xml:space="preserve">Full doc map:</w:t>
+      </w:r>
+      <w:r>
+        <w:t xml:space="preserve"> </w:t>
+      </w:r>
+      <w:hyperlink r:id="rId22">
+        <w:r>
+          <w:rPr>
+            <w:rStyle w:val="VerbatimChar"/>
+          </w:rPr>
+          <w:t xml:space="preserve">DOCUMENTATION.md</w:t>
+        </w:r>
+      </w:hyperlink>
+    </w:p>
+    <w:bookmarkStart w:id="24" w:name="Xcdad859901e63686c5c7795f442b2d03f6e142a"/>
     <w:p>
       <w:pPr>
         <w:pStyle w:val="Heading3"/>
@@ -406,7 +461,18 @@
         <w:t xml:space="preserve"> </w:t>
       </w:r>
       <w:r>
-        <w:t xml:space="preserve">freeze-holdout H-rev cells stay</w:t>
+        <w:t xml:space="preserve">OSF is submitted (</w:t>
+      </w:r>
+      <w:hyperlink r:id="rId23">
+        <w:r>
+          <w:rPr>
+            <w:rStyle w:val="Hyperlink"/>
+          </w:rPr>
+          <w:t xml:space="preserve">osf.io/24sxf</w:t>
+        </w:r>
+      </w:hyperlink>
+      <w:r>
+        <w:t xml:space="preserve">); freeze-holdout cells stay blank until one</w:t>
       </w:r>
       <w:r>
         <w:t xml:space="preserve"> </w:t>
@@ -415,25 +481,13 @@
         <w:rPr>
           <w:rStyle w:val="VerbatimChar"/>
         </w:rPr>
-        <w:t xml:space="preserve">pending_confirmatory</w:t>
-      </w:r>
-      <w:r>
-        <w:t xml:space="preserve"> </w:t>
-      </w:r>
-      <w:r>
-        <w:t xml:space="preserve">until OSF/Zenodo + one</w:t>
-      </w:r>
-      <w:r>
-        <w:t xml:space="preserve"> </w:t>
-      </w:r>
-      <w:r>
-        <w:rPr>
-          <w:rStyle w:val="VerbatimChar"/>
-        </w:rPr>
         <w:t xml:space="preserve">--touch-test</w:t>
       </w:r>
       <w:r>
-        <w:t xml:space="preserve">. Exploratory / diagnostic numbers below are real measured outputs.</w:t>
+        <w:t xml:space="preserve"> </w:t>
+      </w:r>
+      <w:r>
+        <w:t xml:space="preserve">after approval. Numbers below are real measured outputs, but exploratory / diagnostic unless labeled otherwise.</w:t>
       </w:r>
     </w:p>
     <w:p>
@@ -443,8 +497,8 @@
         </w:pict>
       </w:r>
     </w:p>
-    <w:bookmarkEnd w:id="11"/>
-    <w:bookmarkStart w:id="18" w:name="dataset-input"/>
+    <w:bookmarkEnd w:id="24"/>
+    <w:bookmarkStart w:id="31" w:name="dataset-input"/>
     <w:p>
       <w:pPr>
         <w:pStyle w:val="Heading2"/>
@@ -453,7 +507,7 @@
         <w:t xml:space="preserve">1. Dataset / Input</w:t>
       </w:r>
     </w:p>
-    <w:bookmarkStart w:id="12" w:name="what-datasets-are-we-using"/>
+    <w:bookmarkStart w:id="25" w:name="what-datasets-are-we-using"/>
     <w:p>
       <w:pPr>
         <w:pStyle w:val="Heading3"/>
@@ -652,8 +706,8 @@
         <w:t xml:space="preserve">(no shared concept ids; ~96.7% pass rate unusable for memory ROC).</w:t>
       </w:r>
     </w:p>
-    <w:bookmarkEnd w:id="12"/>
-    <w:bookmarkStart w:id="13" w:name="where-did-each-dataset-come-from"/>
+    <w:bookmarkEnd w:id="25"/>
+    <w:bookmarkStart w:id="26" w:name="where-did-each-dataset-come-from"/>
     <w:p>
       <w:pPr>
         <w:pStyle w:val="Heading3"/>
@@ -916,8 +970,8 @@
         <w:t xml:space="preserve">(release blocker).</w:t>
       </w:r>
     </w:p>
-    <w:bookmarkEnd w:id="13"/>
-    <w:bookmarkStart w:id="14" w:name="what-does-the-primary-dataset-contain"/>
+    <w:bookmarkEnd w:id="26"/>
+    <w:bookmarkStart w:id="27" w:name="what-does-the-primary-dataset-contain"/>
     <w:p>
       <w:pPr>
         <w:pStyle w:val="Heading3"/>
@@ -1500,8 +1554,8 @@
         <w:t xml:space="preserve">— every log item id is a DAG node id.</w:t>
       </w:r>
     </w:p>
-    <w:bookmarkEnd w:id="14"/>
-    <w:bookmarkStart w:id="15" w:name="purpose-why-these-datasets"/>
+    <w:bookmarkEnd w:id="27"/>
+    <w:bookmarkStart w:id="28" w:name="purpose-why-these-datasets"/>
     <w:p>
       <w:pPr>
         <w:pStyle w:val="Heading3"/>
@@ -1565,8 +1619,8 @@
         <w:t xml:space="preserve">is platform- or granularity-specific. Timed Junyi supports exploratory day-gap (H-forget) checks.</w:t>
       </w:r>
     </w:p>
-    <w:bookmarkEnd w:id="15"/>
-    <w:bookmarkStart w:id="16" w:name="X57eedd9ab8e17c3ef28d7cc64e8414863afe6cd"/>
+    <w:bookmarkEnd w:id="28"/>
+    <w:bookmarkStart w:id="29" w:name="X57eedd9ab8e17c3ef28d7cc64e8414863afe6cd"/>
     <w:p>
       <w:pPr>
         <w:pStyle w:val="Heading3"/>
@@ -1948,8 +2002,8 @@
         <w:t xml:space="preserve">XES3G5M: 18,066 uids (train 14,453 / test 3,613). Question-level next==last ≈ 0.008.</w:t>
       </w:r>
     </w:p>
-    <w:bookmarkEnd w:id="16"/>
-    <w:bookmarkStart w:id="17" w:name="why-multiple-datasets"/>
+    <w:bookmarkEnd w:id="29"/>
+    <w:bookmarkStart w:id="30" w:name="why-multiple-datasets"/>
     <w:p>
       <w:pPr>
         <w:pStyle w:val="Heading3"/>
@@ -2087,9 +2141,9 @@
         </w:pict>
       </w:r>
     </w:p>
-    <w:bookmarkEnd w:id="17"/>
-    <w:bookmarkEnd w:id="18"/>
-    <w:bookmarkStart w:id="28" w:name="input-at-each-phase"/>
+    <w:bookmarkEnd w:id="30"/>
+    <w:bookmarkEnd w:id="31"/>
+    <w:bookmarkStart w:id="41" w:name="input-at-each-phase"/>
     <w:p>
       <w:pPr>
         <w:pStyle w:val="Heading2"/>
@@ -2136,7 +2190,7 @@
         <w:t xml:space="preserve">/ follow-ups / freeze — not a generic ML template.</w:t>
       </w:r>
     </w:p>
-    <w:bookmarkStart w:id="19" w:name="phase-1-prepare"/>
+    <w:bookmarkStart w:id="32" w:name="phase-1-prepare"/>
     <w:p>
       <w:pPr>
         <w:pStyle w:val="Heading3"/>
@@ -2317,8 +2371,8 @@
         </w:tc>
       </w:tr>
     </w:tbl>
-    <w:bookmarkEnd w:id="19"/>
-    <w:bookmarkStart w:id="20" w:name="phase-2-embeddings"/>
+    <w:bookmarkEnd w:id="32"/>
+    <w:bookmarkStart w:id="33" w:name="phase-2-embeddings"/>
     <w:p>
       <w:pPr>
         <w:pStyle w:val="Heading3"/>
@@ -2472,8 +2526,8 @@
         </w:tc>
       </w:tr>
     </w:tbl>
-    <w:bookmarkEnd w:id="20"/>
-    <w:bookmarkStart w:id="21" w:name="phase-3-memory-classification"/>
+    <w:bookmarkEnd w:id="33"/>
+    <w:bookmarkStart w:id="34" w:name="phase-3-memory-classification"/>
     <w:p>
       <w:pPr>
         <w:pStyle w:val="Heading3"/>
@@ -2679,8 +2733,8 @@
         </w:tc>
       </w:tr>
     </w:tbl>
-    <w:bookmarkEnd w:id="21"/>
-    <w:bookmarkStart w:id="22" w:name="phase-4-graph-next-item-mix"/>
+    <w:bookmarkEnd w:id="34"/>
+    <w:bookmarkStart w:id="35" w:name="phase-4-graph-next-item-mix"/>
     <w:p>
       <w:pPr>
         <w:pStyle w:val="Heading3"/>
@@ -2822,8 +2876,8 @@
         </w:tc>
       </w:tr>
     </w:tbl>
-    <w:bookmarkEnd w:id="22"/>
-    <w:bookmarkStart w:id="23" w:name="phase-5-reviewadvance-gated-ranker-ragr"/>
+    <w:bookmarkEnd w:id="35"/>
+    <w:bookmarkStart w:id="36" w:name="phase-5-reviewadvance-gated-ranker-ragr"/>
     <w:p>
       <w:pPr>
         <w:pStyle w:val="Heading3"/>
@@ -2962,8 +3016,8 @@
         </w:tc>
       </w:tr>
     </w:tbl>
-    <w:bookmarkEnd w:id="23"/>
-    <w:bookmarkStart w:id="24" w:name="phase-6-evaluation"/>
+    <w:bookmarkEnd w:id="36"/>
+    <w:bookmarkStart w:id="37" w:name="phase-6-evaluation"/>
     <w:p>
       <w:pPr>
         <w:pStyle w:val="Heading3"/>
@@ -3108,8 +3162,8 @@
         </w:tc>
       </w:tr>
     </w:tbl>
-    <w:bookmarkEnd w:id="24"/>
-    <w:bookmarkStart w:id="25" w:name="Xaa471121a205e5f6f38eeeb298a7b7c9cfd8357"/>
+    <w:bookmarkEnd w:id="37"/>
+    <w:bookmarkStart w:id="38" w:name="Xaa471121a205e5f6f38eeeb298a7b7c9cfd8357"/>
     <w:p>
       <w:pPr>
         <w:pStyle w:val="Heading3"/>
@@ -3260,8 +3314,8 @@
         </w:tc>
       </w:tr>
     </w:tbl>
-    <w:bookmarkEnd w:id="25"/>
-    <w:bookmarkStart w:id="26" w:name="X3e2bc4884acac9b0a11c97860f3f92f98da6865"/>
+    <w:bookmarkEnd w:id="38"/>
+    <w:bookmarkStart w:id="39" w:name="X3e2bc4884acac9b0a11c97860f3f92f98da6865"/>
     <w:p>
       <w:pPr>
         <w:pStyle w:val="Heading3"/>
@@ -3456,8 +3510,8 @@
         </w:tc>
       </w:tr>
     </w:tbl>
-    <w:bookmarkEnd w:id="26"/>
-    <w:bookmarkStart w:id="27" w:name="X7567a5511cd4dd1b40ad440abbebc33d44985d7"/>
+    <w:bookmarkEnd w:id="39"/>
+    <w:bookmarkStart w:id="40" w:name="X7567a5511cd4dd1b40ad440abbebc33d44985d7"/>
     <w:p>
       <w:pPr>
         <w:pStyle w:val="Heading3"/>
@@ -3657,9 +3711,9 @@
         </w:pict>
       </w:r>
     </w:p>
-    <w:bookmarkEnd w:id="27"/>
-    <w:bookmarkEnd w:id="28"/>
-    <w:bookmarkStart w:id="29" w:name="implementation-plan-dataset-travel"/>
+    <w:bookmarkEnd w:id="40"/>
+    <w:bookmarkEnd w:id="41"/>
+    <w:bookmarkStart w:id="42" w:name="implementation-plan-dataset-travel"/>
     <w:p>
       <w:pPr>
         <w:pStyle w:val="Heading2"/>
@@ -4241,8 +4295,8 @@
         </w:pict>
       </w:r>
     </w:p>
-    <w:bookmarkEnd w:id="29"/>
-    <w:bookmarkStart w:id="42" w:name="output-results-what-we-actually-got"/>
+    <w:bookmarkEnd w:id="42"/>
+    <w:bookmarkStart w:id="55" w:name="output-results-what-we-actually-got"/>
     <w:p>
       <w:pPr>
         <w:pStyle w:val="Heading2"/>
@@ -4251,7 +4305,7 @@
         <w:t xml:space="preserve">4. Output / Results (what we actually got)</w:t>
       </w:r>
     </w:p>
-    <w:bookmarkStart w:id="30" w:name="files-written"/>
+    <w:bookmarkStart w:id="43" w:name="files-written"/>
     <w:p>
       <w:pPr>
         <w:pStyle w:val="Heading3"/>
@@ -4515,8 +4569,8 @@
         </w:tc>
       </w:tr>
     </w:tbl>
-    <w:bookmarkEnd w:id="30"/>
-    <w:bookmarkStart w:id="31" w:name="Xc4bbfbc1ee55aebb3f268eeb8db268c0a5b71b0"/>
+    <w:bookmarkEnd w:id="43"/>
+    <w:bookmarkStart w:id="44" w:name="Xc4bbfbc1ee55aebb3f268eeb8db268c0a5b71b0"/>
     <w:p>
       <w:pPr>
         <w:pStyle w:val="Heading3"/>
@@ -4982,8 +5036,8 @@
         <w:t xml:space="preserve">= never seen. Failed last item is ranked first with low recall probability.</w:t>
       </w:r>
     </w:p>
-    <w:bookmarkEnd w:id="31"/>
-    <w:bookmarkStart w:id="32" w:name="phase-4-next-item-mix-intermediate"/>
+    <w:bookmarkEnd w:id="44"/>
+    <w:bookmarkStart w:id="45" w:name="phase-4-next-item-mix-intermediate"/>
     <w:p>
       <w:pPr>
         <w:pStyle w:val="Heading3"/>
@@ -5054,8 +5108,8 @@
         <w:t xml:space="preserve">.</w:t>
       </w:r>
     </w:p>
-    <w:bookmarkEnd w:id="32"/>
-    <w:bookmarkStart w:id="33" w:name="X01b20b82f141096a8d63c7857e2c86ec6a3331e"/>
+    <w:bookmarkEnd w:id="45"/>
+    <w:bookmarkStart w:id="46" w:name="X01b20b82f141096a8d63c7857e2c86ec6a3331e"/>
     <w:p>
       <w:pPr>
         <w:pStyle w:val="Heading3"/>
@@ -5585,8 +5639,8 @@
         <w:t xml:space="preserve">.</w:t>
       </w:r>
     </w:p>
-    <w:bookmarkEnd w:id="33"/>
-    <w:bookmarkStart w:id="34" w:name="concept-level-repetition-follow-up-3"/>
+    <w:bookmarkEnd w:id="46"/>
+    <w:bookmarkStart w:id="47" w:name="concept-level-repetition-follow-up-3"/>
     <w:p>
       <w:pPr>
         <w:pStyle w:val="Heading3"/>
@@ -6130,8 +6184,8 @@
         <w:t xml:space="preserve">rows after len≥12.</w:t>
       </w:r>
     </w:p>
-    <w:bookmarkEnd w:id="34"/>
-    <w:bookmarkStart w:id="35" w:name="xes-kc-methods-quiz-order-structure"/>
+    <w:bookmarkEnd w:id="47"/>
+    <w:bookmarkStart w:id="48" w:name="xes-kc-methods-quiz-order-structure"/>
     <w:p>
       <w:pPr>
         <w:pStyle w:val="Heading3"/>
@@ -6264,8 +6318,8 @@
         <w:t xml:space="preserve">without modeling spaced revisit.</w:t>
       </w:r>
     </w:p>
-    <w:bookmarkEnd w:id="35"/>
-    <w:bookmarkStart w:id="36" w:name="forgetting-redo-gap-1-day"/>
+    <w:bookmarkEnd w:id="48"/>
+    <w:bookmarkStart w:id="49" w:name="forgetting-redo-gap-1-day"/>
     <w:p>
       <w:pPr>
         <w:pStyle w:val="Heading3"/>
@@ -6292,8 +6346,8 @@
         <w:t xml:space="preserve">. success AUC=0.661; +log1p gap=0.661; paired Δ=0.0003 CI [-0.0010604327518647706, 0.0015754188667389726].</w:t>
       </w:r>
     </w:p>
-    <w:bookmarkEnd w:id="36"/>
-    <w:bookmarkStart w:id="37" w:name="exact-duplicate-chance"/>
+    <w:bookmarkEnd w:id="49"/>
+    <w:bookmarkStart w:id="50" w:name="exact-duplicate-chance"/>
     <w:p>
       <w:pPr>
         <w:pStyle w:val="Heading3"/>
@@ -6310,8 +6364,8 @@
         <w:t xml:space="preserve">Real train∩test exact overlaps = 23; chance baseline = 23 (real−chance=0).</w:t>
       </w:r>
     </w:p>
-    <w:bookmarkEnd w:id="37"/>
-    <w:bookmarkStart w:id="38" w:name="Xc1ccb889bb057885f1af7e223bf2d96070d1e9c"/>
+    <w:bookmarkEnd w:id="50"/>
+    <w:bookmarkStart w:id="51" w:name="Xc1ccb889bb057885f1af7e223bf2d96070d1e9c"/>
     <w:p>
       <w:pPr>
         <w:pStyle w:val="Heading3"/>
@@ -6969,8 +7023,8 @@
         <w:t xml:space="preserve">for schema-4 freeze tables (cluster-unit Markov, used cluster counts 115/106/120, val query counts, dual clustering). The PDF §4.9 rank-reversal study also points to PDF §4.11.</w:t>
       </w:r>
     </w:p>
-    <w:bookmarkEnd w:id="38"/>
-    <w:bookmarkStart w:id="39" w:name="Xbc1cf41b367b54aa5cf9b29c4891172c16d4fd4"/>
+    <w:bookmarkEnd w:id="51"/>
+    <w:bookmarkStart w:id="52" w:name="Xbc1cf41b367b54aa5cf9b29c4891172c16d4fd4"/>
     <w:p>
       <w:pPr>
         <w:pStyle w:val="Heading3"/>
@@ -7471,8 +7525,8 @@
         <w:t xml:space="preserve">(ids/KC tags only) so co-occurrence only. Junyi text↔cooc ARI=0.038; ASSIST ARI=0.073. A clustering-method contrast counts only if both methods agree.</w:t>
       </w:r>
     </w:p>
-    <w:bookmarkEnd w:id="39"/>
-    <w:bookmarkStart w:id="40" w:name="X8eb93fa06f0a410e2f74641a78d2b3dada32c3e"/>
+    <w:bookmarkEnd w:id="52"/>
+    <w:bookmarkStart w:id="53" w:name="X8eb93fa06f0a410e2f74641a78d2b3dada32c3e"/>
     <w:p>
       <w:pPr>
         <w:pStyle w:val="Heading3"/>
@@ -7769,8 +7823,8 @@
         <w:t xml:space="preserve">.</w:t>
       </w:r>
     </w:p>
-    <w:bookmarkEnd w:id="40"/>
-    <w:bookmarkStart w:id="41" w:name="Xd3cb447132f56876131b9927d9f5cb80ac8db75"/>
+    <w:bookmarkEnd w:id="53"/>
+    <w:bookmarkStart w:id="54" w:name="Xd3cb447132f56876131b9927d9f5cb80ac8db75"/>
     <w:p>
       <w:pPr>
         <w:pStyle w:val="Heading3"/>
@@ -8137,9 +8191,9 @@
         </w:pict>
       </w:r>
     </w:p>
-    <w:bookmarkEnd w:id="41"/>
-    <w:bookmarkEnd w:id="42"/>
-    <w:bookmarkStart w:id="44" w:name="visualizations"/>
+    <w:bookmarkEnd w:id="54"/>
+    <w:bookmarkEnd w:id="55"/>
+    <w:bookmarkStart w:id="57" w:name="visualizations"/>
     <w:p>
       <w:pPr>
         <w:pStyle w:val="Heading2"/>
@@ -8629,7 +8683,7 @@
         </w:tc>
       </w:tr>
     </w:tbl>
-    <w:bookmarkStart w:id="43" w:name="how-to-open-figures"/>
+    <w:bookmarkStart w:id="56" w:name="how-to-open-figures"/>
     <w:p>
       <w:pPr>
         <w:pStyle w:val="Heading3"/>
@@ -8644,45 +8698,81 @@
       </w:pPr>
       <w:r>
         <w:rPr>
-          <w:rStyle w:val="VerbatimChar"/>
-        </w:rPr>
-        <w:t xml:space="preserve">open outputs_junyi/figures/memory_roc.png</w:t>
+          <w:rStyle w:val="ExtensionTok"/>
+        </w:rPr>
+        <w:t xml:space="preserve">open</w:t>
+      </w:r>
+      <w:r>
+        <w:rPr>
+          <w:rStyle w:val="NormalTok"/>
+        </w:rPr>
+        <w:t xml:space="preserve"> outputs_junyi/figures/memory_roc.png</w:t>
       </w:r>
       <w:r>
         <w:br/>
       </w:r>
       <w:r>
         <w:rPr>
-          <w:rStyle w:val="VerbatimChar"/>
-        </w:rPr>
-        <w:t xml:space="preserve">open outputs_junyi/figures/memory_confusion.png</w:t>
+          <w:rStyle w:val="ExtensionTok"/>
+        </w:rPr>
+        <w:t xml:space="preserve">open</w:t>
+      </w:r>
+      <w:r>
+        <w:rPr>
+          <w:rStyle w:val="NormalTok"/>
+        </w:rPr>
+        <w:t xml:space="preserve"> outputs_junyi/figures/memory_confusion.png</w:t>
       </w:r>
       <w:r>
         <w:br/>
       </w:r>
       <w:r>
         <w:rPr>
-          <w:rStyle w:val="VerbatimChar"/>
-        </w:rPr>
-        <w:t xml:space="preserve">open outputs_junyi/figures/ranking_recall.png</w:t>
+          <w:rStyle w:val="ExtensionTok"/>
+        </w:rPr>
+        <w:t xml:space="preserve">open</w:t>
+      </w:r>
+      <w:r>
+        <w:rPr>
+          <w:rStyle w:val="NormalTok"/>
+        </w:rPr>
+        <w:t xml:space="preserve"> outputs_junyi/figures/ranking_recall.png</w:t>
       </w:r>
       <w:r>
         <w:br/>
       </w:r>
       <w:r>
         <w:rPr>
-          <w:rStyle w:val="VerbatimChar"/>
-        </w:rPr>
-        <w:t xml:space="preserve">open paper_assets/figures/fig_gate_reliability.png</w:t>
+          <w:rStyle w:val="ExtensionTok"/>
+        </w:rPr>
+        <w:t xml:space="preserve">open</w:t>
+      </w:r>
+      <w:r>
+        <w:rPr>
+          <w:rStyle w:val="NormalTok"/>
+        </w:rPr>
+        <w:t xml:space="preserve"> paper_assets/figures/fig_gate_reliability.png</w:t>
       </w:r>
       <w:r>
         <w:br/>
       </w:r>
       <w:r>
         <w:rPr>
-          <w:rStyle w:val="VerbatimChar"/>
-        </w:rPr>
-        <w:t xml:space="preserve">open docs/NeuroTrace-DAG_Data_Flow_Report.pdf   # all figures embedded</w:t>
+          <w:rStyle w:val="ExtensionTok"/>
+        </w:rPr>
+        <w:t xml:space="preserve">open</w:t>
+      </w:r>
+      <w:r>
+        <w:rPr>
+          <w:rStyle w:val="NormalTok"/>
+        </w:rPr>
+        <w:t xml:space="preserve"> docs/NeuroTrace-DAG_Data_Flow_Report.pdf   </w:t>
+      </w:r>
+      <w:r>
+        <w:rPr>
+          <w:rStyle w:val="CommentTok"/>
+        </w:rPr>
+        <w:t xml:space="preserve"># all figures embedded</w:t>
       </w:r>
     </w:p>
     <w:p>
@@ -8692,9 +8782,9 @@
         </w:pict>
       </w:r>
     </w:p>
-    <w:bookmarkEnd w:id="43"/>
-    <w:bookmarkEnd w:id="44"/>
-    <w:bookmarkStart w:id="50" w:name="roc-auc-curve"/>
+    <w:bookmarkEnd w:id="56"/>
+    <w:bookmarkEnd w:id="57"/>
+    <w:bookmarkStart w:id="63" w:name="roc-auc-curve"/>
     <w:p>
       <w:pPr>
         <w:pStyle w:val="Heading2"/>
@@ -8703,7 +8793,7 @@
         <w:t xml:space="preserve">6. ROC / AUC Curve</w:t>
       </w:r>
     </w:p>
-    <w:bookmarkStart w:id="45" w:name="what-is-being-classified"/>
+    <w:bookmarkStart w:id="58" w:name="what-is-being-classified"/>
     <w:p>
       <w:pPr>
         <w:pStyle w:val="Heading3"/>
@@ -8736,8 +8826,8 @@
         <w:t xml:space="preserve">(0/1). A row exists only when a concept is attempted again in the same sequence; the first attempt on a concept is not a row.</w:t>
       </w:r>
     </w:p>
-    <w:bookmarkEnd w:id="45"/>
-    <w:bookmarkStart w:id="46" w:name="inputs-predictions-used-for-the-roc"/>
+    <w:bookmarkEnd w:id="58"/>
+    <w:bookmarkStart w:id="59" w:name="inputs-predictions-used-for-the-roc"/>
     <w:p>
       <w:pPr>
         <w:pStyle w:val="Heading3"/>
@@ -8984,8 +9074,8 @@
         </w:tc>
       </w:tr>
     </w:tbl>
-    <w:bookmarkEnd w:id="46"/>
-    <w:bookmarkStart w:id="47" w:name="what-the-roc-represents"/>
+    <w:bookmarkEnd w:id="59"/>
+    <w:bookmarkStart w:id="60" w:name="what-the-roc-represents"/>
     <w:p>
       <w:pPr>
         <w:pStyle w:val="Heading3"/>
@@ -9002,8 +9092,8 @@
         <w:t xml:space="preserve">Trade-off between true-positive rate and false-positive rate as the decision threshold on P(correct) moves. AUC ≈ probability that a random correct attempt scores higher than a random incorrect one.</w:t>
       </w:r>
     </w:p>
-    <w:bookmarkEnd w:id="47"/>
-    <w:bookmarkStart w:id="48" w:name="Xf93f4e94106192fd3e78f7e4fa8154f0f472129"/>
+    <w:bookmarkEnd w:id="60"/>
+    <w:bookmarkStart w:id="61" w:name="Xf93f4e94106192fd3e78f7e4fa8154f0f472129"/>
     <w:p>
       <w:pPr>
         <w:pStyle w:val="Heading3"/>
@@ -9467,8 +9557,8 @@
         <w:t xml:space="preserve">.</w:t>
       </w:r>
     </w:p>
-    <w:bookmarkEnd w:id="48"/>
-    <w:bookmarkStart w:id="49" w:name="X9dfbed672335241ec1d396a6ad4526880c4bebf"/>
+    <w:bookmarkEnd w:id="61"/>
+    <w:bookmarkStart w:id="62" w:name="X9dfbed672335241ec1d396a6ad4526880c4bebf"/>
     <w:p>
       <w:pPr>
         <w:pStyle w:val="Heading3"/>
@@ -9664,9 +9754,9 @@
         </w:pict>
       </w:r>
     </w:p>
-    <w:bookmarkEnd w:id="49"/>
-    <w:bookmarkEnd w:id="50"/>
-    <w:bookmarkStart w:id="53" w:name="X96d41fcafffb5030deb28ac3e6c8025d72302cb"/>
+    <w:bookmarkEnd w:id="62"/>
+    <w:bookmarkEnd w:id="63"/>
+    <w:bookmarkStart w:id="66" w:name="X96d41fcafffb5030deb28ac3e6c8025d72302cb"/>
     <w:p>
       <w:pPr>
         <w:pStyle w:val="Heading2"/>
@@ -10118,7 +10208,7 @@
         <w:t xml:space="preserve">                IEEE conference draft (paper/ieee/), live demo</w:t>
       </w:r>
     </w:p>
-    <w:bookmarkStart w:id="51" w:name="reader-map"/>
+    <w:bookmarkStart w:id="64" w:name="reader-map"/>
     <w:p>
       <w:pPr>
         <w:pStyle w:val="Heading3"/>
@@ -10337,8 +10427,8 @@
         </w:tc>
       </w:tr>
     </w:tbl>
-    <w:bookmarkEnd w:id="51"/>
-    <w:bookmarkStart w:id="52" w:name="reproduce"/>
+    <w:bookmarkEnd w:id="64"/>
+    <w:bookmarkStart w:id="65" w:name="reproduce"/>
     <w:p>
       <w:pPr>
         <w:pStyle w:val="Heading3"/>
@@ -10353,81 +10443,195 @@
       </w:pPr>
       <w:r>
         <w:rPr>
-          <w:rStyle w:val="VerbatimChar"/>
-        </w:rPr>
-        <w:t xml:space="preserve">python3 scripts/fetch_datasets.py</w:t>
+          <w:rStyle w:val="ExtensionTok"/>
+        </w:rPr>
+        <w:t xml:space="preserve">python3</w:t>
+      </w:r>
+      <w:r>
+        <w:rPr>
+          <w:rStyle w:val="NormalTok"/>
+        </w:rPr>
+        <w:t xml:space="preserve"> scripts/fetch_datasets.py</w:t>
       </w:r>
       <w:r>
         <w:br/>
       </w:r>
       <w:r>
         <w:rPr>
-          <w:rStyle w:val="VerbatimChar"/>
-        </w:rPr>
-        <w:t xml:space="preserve">python3 run_all_phases.py          # or run_valid_eval.py for validated Phase 3/6</w:t>
+          <w:rStyle w:val="ExtensionTok"/>
+        </w:rPr>
+        <w:t xml:space="preserve">python3</w:t>
+      </w:r>
+      <w:r>
+        <w:rPr>
+          <w:rStyle w:val="NormalTok"/>
+        </w:rPr>
+        <w:t xml:space="preserve"> run_all_phases.py          </w:t>
+      </w:r>
+      <w:r>
+        <w:rPr>
+          <w:rStyle w:val="CommentTok"/>
+        </w:rPr>
+        <w:t xml:space="preserve"># or run_valid_eval.py for validated Phase 3/6</w:t>
       </w:r>
       <w:r>
         <w:br/>
       </w:r>
       <w:r>
         <w:rPr>
-          <w:rStyle w:val="VerbatimChar"/>
-        </w:rPr>
-        <w:t xml:space="preserve">python3 run_followup3.py</w:t>
+          <w:rStyle w:val="ExtensionTok"/>
+        </w:rPr>
+        <w:t xml:space="preserve">python3</w:t>
+      </w:r>
+      <w:r>
+        <w:rPr>
+          <w:rStyle w:val="NormalTok"/>
+        </w:rPr>
+        <w:t xml:space="preserve"> run_followup3.py</w:t>
       </w:r>
       <w:r>
         <w:br/>
       </w:r>
       <w:r>
         <w:rPr>
-          <w:rStyle w:val="VerbatimChar"/>
-        </w:rPr>
-        <w:t xml:space="preserve">python3 run_probe_freeze.py</w:t>
+          <w:rStyle w:val="ExtensionTok"/>
+        </w:rPr>
+        <w:t xml:space="preserve">python3</w:t>
+      </w:r>
+      <w:r>
+        <w:rPr>
+          <w:rStyle w:val="NormalTok"/>
+        </w:rPr>
+        <w:t xml:space="preserve"> run_probe_freeze.py</w:t>
       </w:r>
       <w:r>
         <w:br/>
       </w:r>
       <w:r>
         <w:rPr>
-          <w:rStyle w:val="VerbatimChar"/>
-        </w:rPr>
-        <w:t xml:space="preserve">python3 scripts/run_paper_eval.py  # full-test ranking / calibration (slow)</w:t>
+          <w:rStyle w:val="ExtensionTok"/>
+        </w:rPr>
+        <w:t xml:space="preserve">python3</w:t>
+      </w:r>
+      <w:r>
+        <w:rPr>
+          <w:rStyle w:val="NormalTok"/>
+        </w:rPr>
+        <w:t xml:space="preserve"> scripts/run_paper_eval.py  </w:t>
+      </w:r>
+      <w:r>
+        <w:rPr>
+          <w:rStyle w:val="CommentTok"/>
+        </w:rPr>
+        <w:t xml:space="preserve"># full-test ranking / calibration (slow)</w:t>
       </w:r>
       <w:r>
         <w:br/>
       </w:r>
       <w:r>
         <w:rPr>
-          <w:rStyle w:val="VerbatimChar"/>
-        </w:rPr>
-        <w:t xml:space="preserve">python3 scripts/generate_report_assets.py</w:t>
+          <w:rStyle w:val="ExtensionTok"/>
+        </w:rPr>
+        <w:t xml:space="preserve">python3</w:t>
+      </w:r>
+      <w:r>
+        <w:rPr>
+          <w:rStyle w:val="NormalTok"/>
+        </w:rPr>
+        <w:t xml:space="preserve"> scripts/generate_report_assets.py</w:t>
       </w:r>
       <w:r>
         <w:br/>
       </w:r>
       <w:r>
         <w:rPr>
-          <w:rStyle w:val="VerbatimChar"/>
-        </w:rPr>
-        <w:t xml:space="preserve">python3 scripts/build_paper_assets.py</w:t>
+          <w:rStyle w:val="ExtensionTok"/>
+        </w:rPr>
+        <w:t xml:space="preserve">python3</w:t>
+      </w:r>
+      <w:r>
+        <w:rPr>
+          <w:rStyle w:val="NormalTok"/>
+        </w:rPr>
+        <w:t xml:space="preserve"> scripts/build_paper_assets.py</w:t>
       </w:r>
       <w:r>
         <w:br/>
       </w:r>
       <w:r>
         <w:rPr>
-          <w:rStyle w:val="VerbatimChar"/>
-        </w:rPr>
-        <w:t xml:space="preserve">python3 scripts/build_dataflow_report.py --mode=full   # this PDF</w:t>
+          <w:rStyle w:val="ExtensionTok"/>
+        </w:rPr>
+        <w:t xml:space="preserve">python3</w:t>
+      </w:r>
+      <w:r>
+        <w:rPr>
+          <w:rStyle w:val="NormalTok"/>
+        </w:rPr>
+        <w:t xml:space="preserve"> scripts/build_dataflow_report.py </w:t>
+      </w:r>
+      <w:r>
+        <w:rPr>
+          <w:rStyle w:val="AttributeTok"/>
+        </w:rPr>
+        <w:t xml:space="preserve">--mode</w:t>
+      </w:r>
+      <w:r>
+        <w:rPr>
+          <w:rStyle w:val="OperatorTok"/>
+        </w:rPr>
+        <w:t xml:space="preserve">=</w:t>
+      </w:r>
+      <w:r>
+        <w:rPr>
+          <w:rStyle w:val="NormalTok"/>
+        </w:rPr>
+        <w:t xml:space="preserve">full   </w:t>
+      </w:r>
+      <w:r>
+        <w:rPr>
+          <w:rStyle w:val="CommentTok"/>
+        </w:rPr>
+        <w:t xml:space="preserve"># this PDF</w:t>
       </w:r>
       <w:r>
         <w:br/>
       </w:r>
       <w:r>
         <w:rPr>
-          <w:rStyle w:val="VerbatimChar"/>
-        </w:rPr>
-        <w:t xml:space="preserve">python3 scripts/build_dataflow_report.py --mode=slim   # paper-facing slim PDF</w:t>
+          <w:rStyle w:val="ExtensionTok"/>
+        </w:rPr>
+        <w:t xml:space="preserve">python3</w:t>
+      </w:r>
+      <w:r>
+        <w:rPr>
+          <w:rStyle w:val="NormalTok"/>
+        </w:rPr>
+        <w:t xml:space="preserve"> scripts/build_dataflow_report.py </w:t>
+      </w:r>
+      <w:r>
+        <w:rPr>
+          <w:rStyle w:val="AttributeTok"/>
+        </w:rPr>
+        <w:t xml:space="preserve">--mode</w:t>
+      </w:r>
+      <w:r>
+        <w:rPr>
+          <w:rStyle w:val="OperatorTok"/>
+        </w:rPr>
+        <w:t xml:space="preserve">=</w:t>
+      </w:r>
+      <w:r>
+        <w:rPr>
+          <w:rStyle w:val="NormalTok"/>
+        </w:rPr>
+        <w:t xml:space="preserve">slim   </w:t>
+      </w:r>
+      <w:r>
+        <w:rPr>
+          <w:rStyle w:val="CommentTok"/>
+        </w:rPr>
+        <w:t xml:space="preserve"># paper-facing slim PDF</w:t>
       </w:r>
     </w:p>
     <w:p>
@@ -10450,7 +10654,7 @@
         <w:t xml:space="preserve"> </w:t>
       </w:r>
       <w:r>
-        <w:t xml:space="preserve">exists on GitHub. External OSF/Zenodo deposit is the human gate before confirmatory scoring. Deviations:</w:t>
+        <w:t xml:space="preserve">is on GitHub. OSF registration submitted at https://osf.io/24sxf (await approval / DOI). Deviations:</w:t>
       </w:r>
       <w:r>
         <w:t xml:space="preserve"> </w:t>
@@ -10462,7 +10666,7 @@
         <w:t xml:space="preserve">docs/DEVIATIONS.md</w:t>
       </w:r>
       <w:r>
-        <w:t xml:space="preserve">. After OSF only:</w:t>
+        <w:t xml:space="preserve">. After OSF is public, once:</w:t>
       </w:r>
     </w:p>
     <w:p>
@@ -10471,23 +10675,83 @@
       </w:pPr>
       <w:r>
         <w:rPr>
-          <w:rStyle w:val="VerbatimChar"/>
-        </w:rPr>
-        <w:t xml:space="preserve">PYTHONPATH=. python3 scripts/run_freeze_partition_replication.py --touch-test</w:t>
+          <w:rStyle w:val="VariableTok"/>
+        </w:rPr>
+        <w:t xml:space="preserve">PYTHONPATH</w:t>
+      </w:r>
+      <w:r>
+        <w:rPr>
+          <w:rStyle w:val="OperatorTok"/>
+        </w:rPr>
+        <w:t xml:space="preserve">=</w:t>
+      </w:r>
+      <w:r>
+        <w:rPr>
+          <w:rStyle w:val="NormalTok"/>
+        </w:rPr>
+        <w:t xml:space="preserve">. </w:t>
+      </w:r>
+      <w:r>
+        <w:rPr>
+          <w:rStyle w:val="ExtensionTok"/>
+        </w:rPr>
+        <w:t xml:space="preserve">python3</w:t>
+      </w:r>
+      <w:r>
+        <w:rPr>
+          <w:rStyle w:val="NormalTok"/>
+        </w:rPr>
+        <w:t xml:space="preserve"> scripts/run_freeze_partition_replication.py </w:t>
+      </w:r>
+      <w:r>
+        <w:rPr>
+          <w:rStyle w:val="AttributeTok"/>
+        </w:rPr>
+        <w:t xml:space="preserve">--touch-test</w:t>
       </w:r>
       <w:r>
         <w:br/>
       </w:r>
       <w:r>
         <w:rPr>
-          <w:rStyle w:val="VerbatimChar"/>
-        </w:rPr>
-        <w:t xml:space="preserve">PYTHONPATH=. python3 scripts/build_paper_assets.py   # JSON-only fill of H-rev table</w:t>
+          <w:rStyle w:val="VariableTok"/>
+        </w:rPr>
+        <w:t xml:space="preserve">PYTHONPATH</w:t>
+      </w:r>
+      <w:r>
+        <w:rPr>
+          <w:rStyle w:val="OperatorTok"/>
+        </w:rPr>
+        <w:t xml:space="preserve">=</w:t>
+      </w:r>
+      <w:r>
+        <w:rPr>
+          <w:rStyle w:val="NormalTok"/>
+        </w:rPr>
+        <w:t xml:space="preserve">. </w:t>
+      </w:r>
+      <w:r>
+        <w:rPr>
+          <w:rStyle w:val="ExtensionTok"/>
+        </w:rPr>
+        <w:t xml:space="preserve">python3</w:t>
+      </w:r>
+      <w:r>
+        <w:rPr>
+          <w:rStyle w:val="NormalTok"/>
+        </w:rPr>
+        <w:t xml:space="preserve"> scripts/build_paper_assets.py   </w:t>
+      </w:r>
+      <w:r>
+        <w:rPr>
+          <w:rStyle w:val="CommentTok"/>
+        </w:rPr>
+        <w:t xml:space="preserve"># JSON-only fill of H-rev table</w:t>
       </w:r>
     </w:p>
-    <w:bookmarkEnd w:id="52"/>
-    <w:bookmarkEnd w:id="53"/>
-    <w:bookmarkEnd w:id="54"/>
+    <w:bookmarkEnd w:id="65"/>
+    <w:bookmarkEnd w:id="66"/>
+    <w:bookmarkEnd w:id="67"/>
     <w:sectPr>
       <w:footnotePr>
         <w:numRestart w:val="eachSect"/>
@@ -10721,10 +10985,10 @@
   <w:docDefaults>
     <w:rPrDefault>
       <w:rPr>
-        <w:rFonts w:asciiTheme="minorHAnsi" w:cstheme="minorBidi" w:eastAsiaTheme="minorEastAsia" w:hAnsiTheme="minorHAnsi"/>
+        <w:rFonts w:asciiTheme="minorHAnsi" w:cstheme="minorBidi" w:eastAsiaTheme="minorHAnsi" w:hAnsiTheme="minorHAnsi"/>
         <w:sz w:val="24"/>
         <w:szCs w:val="24"/>
-        <w:lang w:bidi="ar-SA" w:eastAsia="zh-CN" w:val="en-US"/>
+        <w:lang w:bidi="ar-SA" w:eastAsia="en-US" w:val="en-US"/>
       </w:rPr>
     </w:rPrDefault>
     <w:pPrDefault>
@@ -11265,6 +11529,13 @@
       </w:tblCellMar>
     </w:tblPr>
     <w:tblStylePr w:type="firstRow">
+      <w:tblPr>
+        <w:jc w:val="left"/>
+        <w:tblInd w:type="dxa" w:w="0"/>
+      </w:tblPr>
+      <w:trPr>
+        <w:jc w:val="left"/>
+      </w:trPr>
       <w:tcPr>
         <w:tcBorders>
           <w:bottom w:val="single"/>

</xml_diff>